<commit_message>
Updated Nic's title to use the information from his email signature block
</commit_message>
<xml_diff>
--- a/Filings/Complaint_Lu_Hu_v_Fire_Insurance_Exchange_FINAL.docx
+++ b/Filings/Complaint_Lu_Hu_v_Fire_Insurance_Exchange_FINAL.docx
@@ -694,7 +694,19 @@
         <w:t>Second inspection (September 6, 2024).</w:t>
       </w:r>
       <w:r>
-        <w:t xml:space="preserve"> Defendant's own Claims Specialist Representative — Property, Nicholas Brau, personally inspected the property. During the inspection, Mr. Brau identified dents on multiple windows alongside Plaintiffs and measured window </w:t>
+        <w:t xml:space="preserve"> Defendant's own </w:t>
+      </w:r>
+      <w:r>
+        <w:t xml:space="preserve">Senior </w:t>
+      </w:r>
+      <w:r>
+        <w:t xml:space="preserve">Claim </w:t>
+      </w:r>
+      <w:r>
+        <w:t>Adjuster</w:t>
+      </w:r>
+      <w:r>
+        <w:t xml:space="preserve">, Nicholas Brau, personally inspected the property. During the inspection, Mr. Brau identified dents on multiple windows alongside Plaintiffs and measured window </w:t>
       </w:r>
       <w:proofErr w:type="gramStart"/>
       <w:r>
@@ -702,11 +714,11 @@
       </w:r>
       <w:proofErr w:type="gramEnd"/>
       <w:r>
-        <w:t xml:space="preserve"> wrote notes and drew windows with dimensions on his paper notebook. Defendant has subsequently asserted, in a written communication on October 10, 2025, that “the file does not contain a report on the requested date.” On October 29, 2025, Mr. Brau personally responded to Plaintiffs' request for his notes by stating “all the information we can </w:t>
+        <w:t xml:space="preserve"> wrote notes and drew windows with dimensions on his paper notebook. Defendant has subsequently asserted, in a written communication on October 10, 2025, that “the file does not contain a report on the requested date.” On October 29, 2025, Mr. Brau personally responded to Plaintiffs' request for his </w:t>
       </w:r>
       <w:r>
         <w:lastRenderedPageBreak/>
-        <w:t>release has already been sent to you” — a statement in tension with Defendant's “no report exists” position.</w:t>
+        <w:t>notes by stating “all the information we can release has already been sent to you” — a statement in tension with Defendant's “no report exists” position.</w:t>
       </w:r>
     </w:p>
     <w:p>

</xml_diff>

<commit_message>
Remove city permit showing hail-damaged exterior work: city permission doesn't have cause.
</commit_message>
<xml_diff>
--- a/Filings/Complaint_Lu_Hu_v_Fire_Insurance_Exchange_FINAL.docx
+++ b/Filings/Complaint_Lu_Hu_v_Fire_Insurance_Exchange_FINAL.docx
@@ -935,17 +935,326 @@
         <w:ind w:left="1440" w:hanging="720"/>
       </w:pPr>
       <w:r>
+        <w:t>c</w:t>
+      </w:r>
+      <w:r>
+        <w:t>.</w:t>
+      </w:r>
+      <w:r>
+        <w:tab/>
+        <w:t>Plaintiffs' contemporaneous canvass of nineteen neighboring homeowners, of whom fourteen confirmed hail-driven exterior repairs in the immediate neighborhood after 2020; and</w:t>
+      </w:r>
+    </w:p>
+    <w:p>
+      <w:pPr>
+        <w:tabs>
+          <w:tab w:val="left" w:pos="1440"/>
+        </w:tabs>
+        <w:spacing w:after="120" w:line="480" w:lineRule="auto"/>
+        <w:ind w:left="1440" w:hanging="720"/>
+      </w:pPr>
+      <w:r>
+        <w:t>d</w:t>
+      </w:r>
+      <w:r>
+        <w:t>.</w:t>
+      </w:r>
+      <w:r>
+        <w:tab/>
+        <w:t xml:space="preserve">Defendant's own September 12, </w:t>
+      </w:r>
+      <w:proofErr w:type="gramStart"/>
+      <w:r>
+        <w:t>2025</w:t>
+      </w:r>
+      <w:proofErr w:type="gramEnd"/>
+      <w:r>
+        <w:t xml:space="preserve"> appraisal award, signed by the umpire Wade </w:t>
+      </w:r>
+      <w:proofErr w:type="spellStart"/>
+      <w:r>
+        <w:t>Roos</w:t>
+      </w:r>
+      <w:proofErr w:type="spellEnd"/>
+      <w:r>
+        <w:t xml:space="preserve"> and by Plaintiffs' appraiser John Foster, finding hail as the cause of loss to insured windows at the property.</w:t>
+      </w:r>
+    </w:p>
+    <w:p>
+      <w:pPr>
+        <w:tabs>
+          <w:tab w:val="left" w:pos="720"/>
+        </w:tabs>
+        <w:spacing w:after="120" w:line="480" w:lineRule="auto"/>
+        <w:ind w:left="720" w:hanging="720"/>
+      </w:pPr>
+      <w:r>
+        <w:t>21.</w:t>
+      </w:r>
+      <w:r>
+        <w:tab/>
+      </w:r>
+      <w:r>
+        <w:rPr>
+          <w:b/>
+          <w:bCs/>
+        </w:rPr>
+        <w:t>The two denials rest on incompatible factual theories.</w:t>
+      </w:r>
+      <w:r>
+        <w:t xml:space="preserve"> The September 3, </w:t>
+      </w:r>
+      <w:proofErr w:type="gramStart"/>
+      <w:r>
+        <w:t>2024</w:t>
+      </w:r>
+      <w:proofErr w:type="gramEnd"/>
+      <w:r>
+        <w:t xml:space="preserve"> letter says no exterior damage exists; the November 4, </w:t>
+      </w:r>
+      <w:proofErr w:type="gramStart"/>
+      <w:r>
+        <w:t>2024</w:t>
+      </w:r>
+      <w:proofErr w:type="gramEnd"/>
+      <w:r>
+        <w:t xml:space="preserve"> letter acknowledges damage exists but blames aging and prior storms. Both cannot be correct.</w:t>
+      </w:r>
+    </w:p>
+    <w:p>
+      <w:pPr>
+        <w:tabs>
+          <w:tab w:val="left" w:pos="720"/>
+        </w:tabs>
+        <w:spacing w:after="120" w:line="480" w:lineRule="auto"/>
+        <w:ind w:left="720" w:hanging="720"/>
+      </w:pPr>
+      <w:r>
+        <w:t>22.</w:t>
+      </w:r>
+      <w:r>
+        <w:tab/>
+      </w:r>
+      <w:r>
+        <w:rPr>
+          <w:b/>
+          <w:bCs/>
+        </w:rPr>
+        <w:t xml:space="preserve">The Prieve report on which the November 4, </w:t>
+      </w:r>
+      <w:proofErr w:type="gramStart"/>
+      <w:r>
+        <w:rPr>
+          <w:b/>
+          <w:bCs/>
+        </w:rPr>
+        <w:t>2024</w:t>
+      </w:r>
+      <w:proofErr w:type="gramEnd"/>
+      <w:r>
+        <w:rPr>
+          <w:b/>
+          <w:bCs/>
+        </w:rPr>
+        <w:t xml:space="preserve"> denial principally rests </w:t>
+      </w:r>
+      <w:proofErr w:type="gramStart"/>
+      <w:r>
+        <w:rPr>
+          <w:b/>
+          <w:bCs/>
+        </w:rPr>
+        <w:t>is</w:t>
+      </w:r>
+      <w:proofErr w:type="gramEnd"/>
+      <w:r>
+        <w:rPr>
+          <w:b/>
+          <w:bCs/>
+        </w:rPr>
+        <w:t xml:space="preserve"> independently deficient on its face.</w:t>
+      </w:r>
+      <w:r>
+        <w:t xml:space="preserve"> The deficiencies include: (a) Defendant scoped Prieve's engagement to “windows only,” excluding from the engineer's mandate the siding, downspouts, flashing, and doors Plaintiffs had reported as damaged, yet Defendant used the report — whose Conclusions purport to opine on siding as well — as the basis for denying the entire claim; (b) Prieve's own Photo Appendix A documents non-window damage in its captions (dented downspouts at A-42, A-91 through A-93, A-98 and A-99; dented flashing at A-103; chipped trim </w:t>
+      </w:r>
+      <w:r>
+        <w:lastRenderedPageBreak/>
+        <w:t xml:space="preserve">board at </w:t>
+      </w:r>
+      <w:r>
+        <w:t>A-53, A-54</w:t>
+      </w:r>
+      <w:r>
+        <w:t xml:space="preserve">, </w:t>
+      </w:r>
+      <w:r>
+        <w:t xml:space="preserve">A-90 and A-148) that the report's narrative and Conclusions do not address; (c) Plaintiffs' gutters and downspouts were replaced after September 13, 2021, such that any dent on those components physically cannot pre-date late 2021 and is direct physical evidence of post-2020 hail activity at the property; (d) the report's Background section acknowledges that “Convective storm activity and hail have been reported on multiple occasions in the area of the subject structure” while its Conclusion 1 states that “no recent hail damage has occurred” — internally inconsistent statements the report does not reconcile; (e) the report's narrative uses the word “dent” or “dents” sixteen separate times on a single page (the east-side discussion) before concluding “no recent hail damage has occurred”; (f) the report contains no quantitative impact-force calculation, no terminal-velocity calculation, no material-specific dent-depth threshold for extruded aluminum or aluminum-clad wood windows, no peer-reviewed citation, and no stated error rate; (g) Conclusion 4's directional dismissal of damage on the east elevation (“storms moving from west to east with hail originating from a westerly direction”) is a generalization not derived from the specific July 13–14, 2024 storm event, which the National Weather Service documents as a multi-round overnight system with severe weather across Minnesota; the generalization is further refuted by Defendant's own September 12, 2025 appraisal award, which awarded a rear/east window (B1.2, family room) as a hail loss alongside a front/west window (F1.7), thereby confirming that hail damaged the east elevation of the dwelling, and by the fact that wind direction is not fixed within a single </w:t>
+      </w:r>
+      <w:r>
+        <w:lastRenderedPageBreak/>
+        <w:t xml:space="preserve">storm — surface winds veer and back as a storm cell approaches, passes, and departs, and gust fronts, outflow boundaries, and a rotating updraft can drive hail against multiple faces of a structure during the same event; (h) the report's Activities section does not list as inputs the Hancock August 29, 2024 inspection </w:t>
+      </w:r>
+      <w:proofErr w:type="spellStart"/>
+      <w:r>
+        <w:t>workproduct</w:t>
+      </w:r>
+      <w:proofErr w:type="spellEnd"/>
+      <w:r>
+        <w:t>, the September 3, 2024 first denial letter, any record of adjuster Nicholas Brau's September 6, 2024 observations, or Plaintiffs' photographic submissions of September 5, 8, and 10, 2024; and (</w:t>
+      </w:r>
+      <w:proofErr w:type="spellStart"/>
+      <w:r>
+        <w:t>i</w:t>
+      </w:r>
+      <w:proofErr w:type="spellEnd"/>
+      <w:r>
+        <w:t xml:space="preserve">) the report's own diagnostic for hail causation, articulated at page 6 in the rear/east garage window discussion (“No smooth or rounded dents were observed in the frame or sashes”), is internally inconsistent with the report's documented observations of “rounded dents … at sashes” at the front/west triple window (page 4) and “two dents … generally smooth” at the north porch four-unit window (page 5), which by Prieve's own diagnostic are hail damage but which Prieve attributes to “a prior hail claim” without methodological support and without alignment to Defendant's own 2020 Xactimate scope. Prieve's operative premise — that hail dents are “smooth or rounded” and that dents containing scrape marks or elongated profiles are “not consistent with hail” — is contrary to published authority of the National Oceanic and Atmospheric Administration and to peer-reviewed engineering and atmospheric-science literature, which establish that hailstones are commonly irregular and lobed and that wind-driven hail strikes building surfaces at oblique angles, routinely producing elongated, off-center, and scrape-marked impact </w:t>
+      </w:r>
+      <w:r>
+        <w:lastRenderedPageBreak/>
+        <w:t>signatures. Defendant adopted this scientifically unsupported diagnostic as a basis for denial.</w:t>
+      </w:r>
+    </w:p>
+    <w:p>
+      <w:pPr>
+        <w:tabs>
+          <w:tab w:val="left" w:pos="720"/>
+        </w:tabs>
+        <w:spacing w:after="120" w:line="480" w:lineRule="auto"/>
+        <w:ind w:left="720" w:hanging="720"/>
+      </w:pPr>
+      <w:r>
+        <w:t>23.</w:t>
+      </w:r>
+      <w:r>
+        <w:tab/>
+      </w:r>
+      <w:r>
+        <w:rPr>
+          <w:b/>
+          <w:bCs/>
+        </w:rPr>
+        <w:t>Defendant's own 2020 claim file establishes a baseline condition of the windows that forecloses its “prior damage” rationale for all but two sashes.</w:t>
+      </w:r>
+      <w:r>
+        <w:t xml:space="preserve"> The 2020 hail claim (claim 3013539499-1) is Defendant's own contemporaneous documentation of the condition of the windows at the property as of the October 13, </w:t>
+      </w:r>
+      <w:proofErr w:type="gramStart"/>
+      <w:r>
+        <w:t>2020</w:t>
+      </w:r>
+      <w:proofErr w:type="gramEnd"/>
+      <w:r>
+        <w:t xml:space="preserve"> inspection. That file does not support the Prieve report's “already paid in 2020” theory:</w:t>
+      </w:r>
+    </w:p>
+    <w:p>
+      <w:pPr>
+        <w:tabs>
+          <w:tab w:val="left" w:pos="1440"/>
+        </w:tabs>
+        <w:spacing w:after="120" w:line="480" w:lineRule="auto"/>
+        <w:ind w:left="1440" w:hanging="720"/>
+      </w:pPr>
+      <w:r>
+        <w:t>a.</w:t>
+      </w:r>
+      <w:r>
+        <w:tab/>
+      </w:r>
+      <w:r>
+        <w:rPr>
+          <w:b/>
+          <w:bCs/>
+        </w:rPr>
+        <w:t>The 2020 scope was two sashes, not the home's windows generally.</w:t>
+      </w:r>
+      <w:r>
+        <w:t xml:space="preserve"> The 2020 Building Loss Worksheet and Xactimate approved two casement windows at line items 1–4, with no other window-related line items. Plaintiffs maintain that the dents within that scope were on two sashes, not two whole window units.</w:t>
+      </w:r>
+    </w:p>
+    <w:p>
+      <w:pPr>
+        <w:tabs>
+          <w:tab w:val="left" w:pos="1440"/>
+        </w:tabs>
+        <w:spacing w:after="120" w:line="480" w:lineRule="auto"/>
+        <w:ind w:left="1440" w:hanging="720"/>
+      </w:pPr>
+      <w:r>
+        <w:t>b.</w:t>
+      </w:r>
+      <w:r>
+        <w:tab/>
+      </w:r>
+      <w:r>
+        <w:rPr>
+          <w:b/>
+          <w:bCs/>
+        </w:rPr>
+        <w:t>Defendant's 2020 inspection documented hail dents warranting repair on only those two sashes and identified no other dented sash or window anywhere on the home.</w:t>
+      </w:r>
+      <w:r>
+        <w:t xml:space="preserve"> Defendant's own record therefore reflects that, as of October 13, 2020, no window or sash on the property other than the two paid sashes was identified as </w:t>
+      </w:r>
+      <w:proofErr w:type="gramStart"/>
+      <w:r>
+        <w:t>hail-damaged</w:t>
+      </w:r>
+      <w:proofErr w:type="gramEnd"/>
+      <w:r>
+        <w:t>. Any dent that the 2024 inspections documented on a different sash or window is, by Defendant's own baseline, damage that post-dates the 2020 inspection.</w:t>
+      </w:r>
+    </w:p>
+    <w:p>
+      <w:pPr>
+        <w:tabs>
+          <w:tab w:val="left" w:pos="1440"/>
+        </w:tabs>
+        <w:spacing w:after="120" w:line="480" w:lineRule="auto"/>
+        <w:ind w:left="1440" w:hanging="720"/>
+      </w:pPr>
+      <w:r>
+        <w:lastRenderedPageBreak/>
         <w:t>c.</w:t>
       </w:r>
       <w:r>
         <w:tab/>
-        <w:t>City of Eden Prairie public permit records documenting hail-driven exterior repairs on the same street as Plaintiffs' home, including permit EP187829 at 17490 George Moran Drive (window replacement, issued November 15, 2023, cause: hail) and permit EP190835 at 17708 George Moran Drive (window replacement, issued May 9, 2024, cause: hail</w:t>
-      </w:r>
-      <w:proofErr w:type="gramStart"/>
-      <w:r>
-        <w:t>);</w:t>
-      </w:r>
-      <w:proofErr w:type="gramEnd"/>
+      </w:r>
+      <w:r>
+        <w:rPr>
+          <w:b/>
+          <w:bCs/>
+        </w:rPr>
+        <w:t xml:space="preserve">The only documented hail event at the property after the 2020 inspection is the July 13, </w:t>
+      </w:r>
+      <w:proofErr w:type="gramStart"/>
+      <w:r>
+        <w:rPr>
+          <w:b/>
+          <w:bCs/>
+        </w:rPr>
+        <w:t>2024</w:t>
+      </w:r>
+      <w:proofErr w:type="gramEnd"/>
+      <w:r>
+        <w:rPr>
+          <w:b/>
+          <w:bCs/>
+        </w:rPr>
+        <w:t xml:space="preserve"> hailstorm.</w:t>
+      </w:r>
+      <w:r>
+        <w:t xml:space="preserve"> The post-2020 dents the Prieve report catalogs across at least nineteen windows therefore align with the July 13, </w:t>
+      </w:r>
+      <w:proofErr w:type="gramStart"/>
+      <w:r>
+        <w:t>2024</w:t>
+      </w:r>
+      <w:proofErr w:type="gramEnd"/>
+      <w:r>
+        <w:t xml:space="preserve"> loss and cannot be attributed to the 2020 claim, which by Defendant's own scope reached only two sashes.</w:t>
+      </w:r>
     </w:p>
     <w:p>
       <w:pPr>
@@ -960,7 +1269,16 @@
       </w:r>
       <w:r>
         <w:tab/>
-        <w:t>Plaintiffs' contemporaneous canvass of nineteen neighboring homeowners, of whom fourteen confirmed hail-driven exterior repairs in the immediate neighborhood after 2020; and</w:t>
+      </w:r>
+      <w:r>
+        <w:rPr>
+          <w:b/>
+          <w:bCs/>
+        </w:rPr>
+        <w:t>Prieve's attribution of dents to “a prior hail claim” exceeds what Defendant's 2020 file can support.</w:t>
+      </w:r>
+      <w:r>
+        <w:t xml:space="preserve"> The Prieve report documents dents at additional sashes on the same windows and attributes “rounded dents … at sashes” on multiple windows to “a prior hail claim,” yet Defendant's 2020 scope compensated only two sashes. The “prior claim” basket cannot hold more sashes than Defendant's own 2020 record documented, and Prieve's attribution of additional sashes to the 2020 claim is contradicted by Defendant's own file.</w:t>
       </w:r>
     </w:p>
     <w:p>
@@ -976,48 +1294,131 @@
       </w:r>
       <w:r>
         <w:tab/>
-        <w:t xml:space="preserve">Defendant's own September 12, </w:t>
-      </w:r>
-      <w:proofErr w:type="gramStart"/>
-      <w:r>
-        <w:t>2025</w:t>
-      </w:r>
-      <w:proofErr w:type="gramEnd"/>
-      <w:r>
-        <w:t xml:space="preserve"> appraisal award, signed by the umpire Wade </w:t>
+      </w:r>
+      <w:r>
+        <w:rPr>
+          <w:b/>
+          <w:bCs/>
+        </w:rPr>
+        <w:t>Defendant's 2020 photo log records observations its 2020 estimate did not pay.</w:t>
+      </w:r>
+      <w:r>
+        <w:t xml:space="preserve"> At page 7 of the Prieve report the engineer acknowledges that the chip he observed at trim board photograph A-53 “is visible in prior photo logs from Farmers Insurance dated October 13, 2020,” yet that trim damage was not addressed in the 2020 Xactimate. This confirms that Defendant's 2020 photo log and 2020 payment scope are not coextensive, and that the precise per-sash 2020 scope is fixed by the 2020 Xactimate and photo log — records Defendant has not produced in full.</w:t>
+      </w:r>
+    </w:p>
+    <w:p>
+      <w:pPr>
+        <w:spacing w:before="160" w:after="80"/>
+      </w:pPr>
+      <w:r>
+        <w:rPr>
+          <w:b/>
+          <w:bCs/>
+        </w:rPr>
+        <w:lastRenderedPageBreak/>
+        <w:t>F. The “Engineer's Report Only” Gatekeeping Rule</w:t>
+      </w:r>
+    </w:p>
+    <w:p>
+      <w:pPr>
+        <w:tabs>
+          <w:tab w:val="left" w:pos="720"/>
+        </w:tabs>
+        <w:spacing w:after="120" w:line="480" w:lineRule="auto"/>
+        <w:ind w:left="720" w:hanging="720"/>
+      </w:pPr>
+      <w:r>
+        <w:t>24.</w:t>
+      </w:r>
+      <w:r>
+        <w:tab/>
+        <w:t>On February 3, 2025, Defendant's field claim supervisor, Bradlee Monson, told Plaintiffs by telephone that Defendant would not review any evidence or documents from Plaintiffs unless they were provided by an engineer. Mr. Monson added during the same conversation that “extruded aluminum windows are easily damaged.”</w:t>
+      </w:r>
+    </w:p>
+    <w:p>
+      <w:pPr>
+        <w:tabs>
+          <w:tab w:val="left" w:pos="720"/>
+        </w:tabs>
+        <w:spacing w:after="120" w:line="480" w:lineRule="auto"/>
+        <w:ind w:left="720" w:hanging="720"/>
+      </w:pPr>
+      <w:r>
+        <w:t>25.</w:t>
+      </w:r>
+      <w:r>
+        <w:tab/>
+        <w:t xml:space="preserve">On February 10, 2025 at 11:06 AM, Defendant's adjuster Nicholas Brau left a voicemail confirming the rule and attributing it to Mr. Monson: “Brad reached out to me on the field claim supervisor wanted me to let you know that he did receive the information that you just sent in recently but it's not an </w:t>
       </w:r>
       <w:proofErr w:type="spellStart"/>
       <w:r>
-        <w:t>Roos</w:t>
+        <w:t>engineers</w:t>
       </w:r>
       <w:proofErr w:type="spellEnd"/>
       <w:r>
-        <w:t xml:space="preserve"> and by Plaintiffs' appraiser John Foster, finding hail as the cause of loss to insured windows at the property.</w:t>
-      </w:r>
-    </w:p>
-    <w:p>
-      <w:pPr>
-        <w:tabs>
-          <w:tab w:val="left" w:pos="720"/>
-        </w:tabs>
-        <w:spacing w:after="120" w:line="480" w:lineRule="auto"/>
-        <w:ind w:left="720" w:hanging="720"/>
-      </w:pPr>
-      <w:r>
-        <w:t>21.</w:t>
-      </w:r>
-      <w:r>
-        <w:tab/>
-      </w:r>
-      <w:r>
-        <w:rPr>
-          <w:b/>
-          <w:bCs/>
-        </w:rPr>
-        <w:t>The two denials rest on incompatible factual theories.</w:t>
-      </w:r>
-      <w:r>
-        <w:t xml:space="preserve"> The September 3, </w:t>
+        <w:t xml:space="preserve"> report so I believe that's what he wanted to look for from you.”</w:t>
+      </w:r>
+    </w:p>
+    <w:p>
+      <w:pPr>
+        <w:tabs>
+          <w:tab w:val="left" w:pos="720"/>
+        </w:tabs>
+        <w:spacing w:after="120" w:line="480" w:lineRule="auto"/>
+        <w:ind w:left="720" w:hanging="720"/>
+      </w:pPr>
+      <w:r>
+        <w:t>26.</w:t>
+      </w:r>
+      <w:r>
+        <w:tab/>
+      </w:r>
+      <w:r>
+        <w:rPr>
+          <w:b/>
+          <w:bCs/>
+        </w:rPr>
+        <w:t>The policy contains no provision requiring evidence to come from an engineer.</w:t>
+      </w:r>
+      <w:r>
+        <w:t xml:space="preserve"> The “engineer's report only” rule was articulated at the supervisor level and enforced through the assigned adjuster. The rule was used to refuse review of (a) Plaintiffs' January 31, 2025 appeal package containing </w:t>
+      </w:r>
+      <w:proofErr w:type="spellStart"/>
+      <w:r>
+        <w:t>stormersite</w:t>
+      </w:r>
+      <w:proofErr w:type="spellEnd"/>
+      <w:r>
+        <w:t xml:space="preserve"> weather data and post-2021 gutter-replacement evidence, (b) Plaintiffs' February 10, 2025 second response containing City of Eden Prairie permit records and the 14-of-19 neighbor canvass, and (c) Plaintiffs' May 28, 2025 submission of the National Weather Service article and Interactive Hail Maps data delivered through Defendant's own agent Peter Pietila.</w:t>
+      </w:r>
+    </w:p>
+    <w:p>
+      <w:pPr>
+        <w:spacing w:before="160" w:after="80"/>
+      </w:pPr>
+      <w:r>
+        <w:rPr>
+          <w:b/>
+          <w:bCs/>
+        </w:rPr>
+        <w:t>G. Plaintiffs' Repeated Submissions of Disproving Evidence; Defendant's Refusal to Engage</w:t>
+      </w:r>
+    </w:p>
+    <w:p>
+      <w:pPr>
+        <w:tabs>
+          <w:tab w:val="left" w:pos="720"/>
+        </w:tabs>
+        <w:spacing w:after="120" w:line="480" w:lineRule="auto"/>
+        <w:ind w:left="720" w:hanging="720"/>
+      </w:pPr>
+      <w:r>
+        <w:lastRenderedPageBreak/>
+        <w:t>27.</w:t>
+      </w:r>
+      <w:r>
+        <w:tab/>
+        <w:t xml:space="preserve">Beginning on September 5, </w:t>
       </w:r>
       <w:proofErr w:type="gramStart"/>
       <w:r>
@@ -1025,516 +1426,103 @@
       </w:r>
       <w:proofErr w:type="gramEnd"/>
       <w:r>
-        <w:t xml:space="preserve"> letter says no exterior damage exists; the November 4, </w:t>
-      </w:r>
-      <w:proofErr w:type="gramStart"/>
-      <w:r>
-        <w:t>2024</w:t>
-      </w:r>
-      <w:proofErr w:type="gramEnd"/>
-      <w:r>
-        <w:t xml:space="preserve"> letter acknowledges damage exists but blames aging and prior storms. Both cannot be correct.</w:t>
-      </w:r>
-    </w:p>
-    <w:p>
-      <w:pPr>
-        <w:tabs>
-          <w:tab w:val="left" w:pos="720"/>
-        </w:tabs>
-        <w:spacing w:after="120" w:line="480" w:lineRule="auto"/>
-        <w:ind w:left="720" w:hanging="720"/>
-      </w:pPr>
-      <w:r>
-        <w:t>22.</w:t>
-      </w:r>
-      <w:r>
-        <w:tab/>
-      </w:r>
-      <w:r>
-        <w:rPr>
-          <w:b/>
-          <w:bCs/>
-        </w:rPr>
-        <w:t xml:space="preserve">The Prieve report on which the November 4, </w:t>
-      </w:r>
-      <w:proofErr w:type="gramStart"/>
-      <w:r>
-        <w:rPr>
-          <w:b/>
-          <w:bCs/>
-        </w:rPr>
-        <w:t>2024</w:t>
-      </w:r>
-      <w:proofErr w:type="gramEnd"/>
-      <w:r>
-        <w:rPr>
-          <w:b/>
-          <w:bCs/>
-        </w:rPr>
-        <w:t xml:space="preserve"> denial principally rests </w:t>
-      </w:r>
-      <w:proofErr w:type="gramStart"/>
-      <w:r>
-        <w:rPr>
-          <w:b/>
-          <w:bCs/>
-        </w:rPr>
-        <w:t>is</w:t>
-      </w:r>
-      <w:proofErr w:type="gramEnd"/>
-      <w:r>
-        <w:rPr>
-          <w:b/>
-          <w:bCs/>
-        </w:rPr>
-        <w:t xml:space="preserve"> independently deficient on its face.</w:t>
-      </w:r>
-      <w:r>
-        <w:t xml:space="preserve"> The deficiencies include: (a) Defendant </w:t>
+        <w:t xml:space="preserve"> and continuing through May 28, 2025, Plaintiffs submitted four separate rounds of evidence disproving the factual premises of Defendant's denials. Defendant did not retract the denials, did not reopen the claim, and did not engage substantively with any of the submissions. Plaintiffs' regulatory complaint to the Minnesota Department of Commerce filed November 19, 2024 (Complaint ID 93547) was processed and escalated to Director-level review but produced no compulsory action.</w:t>
+      </w:r>
+    </w:p>
+    <w:p>
+      <w:pPr>
+        <w:spacing w:before="160" w:after="80"/>
+      </w:pPr>
+      <w:r>
+        <w:rPr>
+          <w:b/>
+          <w:bCs/>
+        </w:rPr>
+        <w:t>H. Plaintiffs' Direct Inquiry About Deadlines; Defendant's Non-Answer; Defendant's Continued Participation in the Claim</w:t>
+      </w:r>
+    </w:p>
+    <w:p>
+      <w:pPr>
+        <w:tabs>
+          <w:tab w:val="left" w:pos="720"/>
+        </w:tabs>
+        <w:spacing w:after="120" w:line="480" w:lineRule="auto"/>
+        <w:ind w:left="720" w:hanging="720"/>
+      </w:pPr>
+      <w:r>
+        <w:t>28.</w:t>
+      </w:r>
+      <w:r>
+        <w:tab/>
+        <w:t xml:space="preserve">On July 10, 2025, Plaintiffs wrote to Defendant's adjuster Nicholas Brau, field claim supervisor Bradlee Monson, and agent Peter Pietila, asking in writing: “Is there any other deadline for hail claim 7007986837-1? If there is any, this email would also serve as our request to extend those deadline(s).” On July 11, 2025, Mr. Brau responded through Defendant's Claim Portal with only the following generic paragraph: “Please note there are time limits set forth in the Conditions (‘Lawsuits Against Us’ or ‘Legal Action Against Us’ or ‘Suit Against Us’) section of the policy which, depending on your state, may affect the time within which you may pursue your claim. This period may have been extended by statute or case law.” The response identified no specific deadline and did not address Plaintiffs' request for an extension. Plaintiffs' same-day follow-up of July 11, 2025, confirming their understanding that the only applicable deadline was the </w:t>
       </w:r>
       <w:r>
         <w:lastRenderedPageBreak/>
-        <w:t xml:space="preserve">scoped Prieve's engagement to “windows only,” excluding from the engineer's mandate the siding, downspouts, flashing, and doors Plaintiffs had reported as damaged, yet Defendant used the report — whose Conclusions purport to opine on siding as well — as the basis for denying the entire claim; (b) Prieve's own Photo Appendix A documents non-window damage in its captions (dented downspouts at A-42, A-91 through A-93, A-98 and A-99; dented flashing at A-103; chipped trim board at A-90 and A-148) that the report's narrative and Conclusions do not address; (c) Plaintiffs' gutters and downspouts were replaced after September 13, 2021, such that any dent on those components physically cannot pre-date late 2021 and is direct physical evidence of post-2020 hail activity at the property; (d) the report's Background section acknowledges that “Convective storm activity and hail have been reported on multiple occasions in the area of the subject structure” while its Conclusion 1 states that “no recent hail damage has occurred” — internally inconsistent statements the report does not reconcile; (e) the report's narrative uses the word “dent” or “dents” sixteen separate times on a single page (the east-side discussion) before concluding “no recent hail damage has occurred”; (f) the report contains no quantitative impact-force calculation, no terminal-velocity calculation, no material-specific dent-depth threshold for extruded aluminum or aluminum-clad wood windows, no peer-reviewed citation, and no stated error rate; (g) Conclusion 4's directional dismissal of damage on the east elevation (“storms moving from west to east with hail originating from a westerly direction”) is a generalization not derived from the specific July 13–14, 2024 </w:t>
+        <w:t>policy's two-year suit limitation, drew no response or correction from Mr. Brau or anyone else at Farmers.</w:t>
+      </w:r>
+    </w:p>
+    <w:p>
+      <w:pPr>
+        <w:tabs>
+          <w:tab w:val="left" w:pos="720"/>
+        </w:tabs>
+        <w:spacing w:after="120" w:line="480" w:lineRule="auto"/>
+        <w:ind w:left="720" w:hanging="720"/>
+      </w:pPr>
+      <w:r>
+        <w:t>29.</w:t>
+      </w:r>
+      <w:r>
+        <w:tab/>
+        <w:t>After Plaintiffs' July 10, 2025 deadline inquiry, Defendant continued to treat the claim as live and participated fully in the contractual appraisal process: Defendant accepted Plaintiffs' August 3, 2025 Demand for Appraisal, named its own appraiser within the statutory window, and proceeded through the September 12, 2025 appraisal inspection and award without ever identifying any deadline shorter than the policy's two-year suit-limitation period or asserting that any limitation period had expired. To the extent any endorsement, statute, or other instrument is later asserted to impose a suit-limitation period shorter than two years, Defendant, by the conduct described in this paragraph and paragraph 28, waived any such shorter period and is estopped from asserting it.</w:t>
+      </w:r>
+    </w:p>
+    <w:p>
+      <w:pPr>
+        <w:spacing w:before="160" w:after="80"/>
+      </w:pPr>
+      <w:r>
+        <w:rPr>
+          <w:b/>
+          <w:bCs/>
+        </w:rPr>
+        <w:t>I. The Appraisal Process</w:t>
+      </w:r>
+    </w:p>
+    <w:p>
+      <w:pPr>
+        <w:tabs>
+          <w:tab w:val="left" w:pos="720"/>
+        </w:tabs>
+        <w:spacing w:after="120" w:line="480" w:lineRule="auto"/>
+        <w:ind w:left="720" w:hanging="720"/>
+      </w:pPr>
+      <w:r>
+        <w:t>30.</w:t>
+      </w:r>
+      <w:r>
+        <w:tab/>
+        <w:t>On August 3, 2025, Pure Construction, on behalf of Plaintiffs, filed a formal Demand for Appraisal under Minn. Stat. § 65A.01, naming claim 7007986837-1-1, loss date July 13, 2024, and three items in dispute: Windows, Siding (repaint), and Siding (replace and remove). Plaintiffs filed a Sworn Statement on Proof of Loss with the demand stating a total claimed loss of $310,000 against Coverage A of $886,000 with a $17,720 deductible.</w:t>
+      </w:r>
+    </w:p>
+    <w:p>
+      <w:pPr>
+        <w:tabs>
+          <w:tab w:val="left" w:pos="720"/>
+        </w:tabs>
+        <w:spacing w:after="120" w:line="480" w:lineRule="auto"/>
+        <w:ind w:left="720" w:hanging="720"/>
+      </w:pPr>
+      <w:r>
+        <w:t>31.</w:t>
+      </w:r>
+      <w:r>
+        <w:tab/>
+        <w:t xml:space="preserve">The appraisal proceeded under § 65A.01. Plaintiffs' appraiser was John Foster, who was selected and retained through contractor Pure Construction; Plaintiffs did </w:t>
       </w:r>
       <w:r>
         <w:lastRenderedPageBreak/>
-        <w:t xml:space="preserve">storm event, which the National Weather Service documents as a multi-round overnight system with severe weather across Minnesota; the generalization is further refuted by Defendant's own September 12, 2025 appraisal award, which awarded a rear/east window (B1.2, family room) as a hail loss alongside a front/west window (F1.7), thereby confirming that hail damaged the east elevation of the dwelling, and by the fact that wind direction is not fixed within a single storm — surface winds veer and back as a storm cell approaches, passes, and departs, and gust fronts, outflow boundaries, and a rotating updraft can drive hail against multiple faces of a structure during the same event; (h) the report's Activities section does not list as inputs the Hancock August 29, 2024 inspection </w:t>
-      </w:r>
-      <w:proofErr w:type="spellStart"/>
-      <w:r>
-        <w:t>workproduct</w:t>
-      </w:r>
-      <w:proofErr w:type="spellEnd"/>
-      <w:r>
-        <w:t>, the September 3, 2024 first denial letter, any record of adjuster Nicholas Brau's September 6, 2024 observations, or Plaintiffs' photographic submissions of September 5, 8, and 10, 2024; and (</w:t>
-      </w:r>
-      <w:proofErr w:type="spellStart"/>
-      <w:r>
-        <w:t>i</w:t>
-      </w:r>
-      <w:proofErr w:type="spellEnd"/>
-      <w:r>
-        <w:t xml:space="preserve">) the report's own diagnostic for hail causation, articulated at page 6 in the rear/east garage window discussion (“No smooth or rounded dents were observed in the frame or sashes”), is internally inconsistent with the report's documented observations of “rounded dents … at sashes” at the front/west triple window (page 4) and “two dents … generally smooth” at the north porch four-unit window (page 5), which by Prieve's own diagnostic are hail damage but which Prieve attributes to “a prior hail claim” without methodological support and without alignment to Defendant's own 2020 Xactimate scope. Prieve's operative premise — that hail dents are “smooth or rounded” and that dents containing scrape marks or elongated profiles are “not </w:t>
-      </w:r>
-      <w:r>
-        <w:lastRenderedPageBreak/>
-        <w:t>consistent with hail” — is contrary to published authority of the National Oceanic and Atmospheric Administration and to peer-reviewed engineering and atmospheric-science literature, which establish that hailstones are commonly irregular and lobed and that wind-driven hail strikes building surfaces at oblique angles, routinely producing elongated, off-center, and scrape-marked impact signatures. Defendant adopted this scientifically unsupported diagnostic as a basis for denial.</w:t>
-      </w:r>
-    </w:p>
-    <w:p>
-      <w:pPr>
-        <w:tabs>
-          <w:tab w:val="left" w:pos="720"/>
-        </w:tabs>
-        <w:spacing w:after="120" w:line="480" w:lineRule="auto"/>
-        <w:ind w:left="720" w:hanging="720"/>
-      </w:pPr>
-      <w:r>
-        <w:t>23.</w:t>
-      </w:r>
-      <w:r>
-        <w:tab/>
-      </w:r>
-      <w:r>
-        <w:rPr>
-          <w:b/>
-          <w:bCs/>
-        </w:rPr>
-        <w:t>Defendant's own 2020 claim file establishes a baseline condition of the windows that forecloses its “prior damage” rationale for all but two sashes.</w:t>
-      </w:r>
-      <w:r>
-        <w:t xml:space="preserve"> The 2020 hail claim (claim 3013539499-1) is Defendant's own contemporaneous documentation of the condition of the windows at the property as of the October 13, </w:t>
-      </w:r>
-      <w:proofErr w:type="gramStart"/>
-      <w:r>
-        <w:t>2020</w:t>
-      </w:r>
-      <w:proofErr w:type="gramEnd"/>
-      <w:r>
-        <w:t xml:space="preserve"> inspection. That file does not support the Prieve report's “already paid in 2020” theory:</w:t>
-      </w:r>
-    </w:p>
-    <w:p>
-      <w:pPr>
-        <w:tabs>
-          <w:tab w:val="left" w:pos="1440"/>
-        </w:tabs>
-        <w:spacing w:after="120" w:line="480" w:lineRule="auto"/>
-        <w:ind w:left="1440" w:hanging="720"/>
-      </w:pPr>
-      <w:r>
-        <w:t>a.</w:t>
-      </w:r>
-      <w:r>
-        <w:tab/>
-      </w:r>
-      <w:r>
-        <w:rPr>
-          <w:b/>
-          <w:bCs/>
-        </w:rPr>
-        <w:t>The 2020 scope was two sashes, not the home's windows generally.</w:t>
-      </w:r>
-      <w:r>
-        <w:t xml:space="preserve"> The 2020 Building Loss Worksheet and Xactimate approved two casement windows at line items 1–4, with no other window-related line items. Plaintiffs maintain that the dents within that scope were on two sashes, not two whole window units.</w:t>
-      </w:r>
-    </w:p>
-    <w:p>
-      <w:pPr>
-        <w:tabs>
-          <w:tab w:val="left" w:pos="1440"/>
-        </w:tabs>
-        <w:spacing w:after="120" w:line="480" w:lineRule="auto"/>
-        <w:ind w:left="1440" w:hanging="720"/>
-      </w:pPr>
-      <w:r>
-        <w:t>b.</w:t>
-      </w:r>
-      <w:r>
-        <w:tab/>
-      </w:r>
-      <w:r>
-        <w:rPr>
-          <w:b/>
-          <w:bCs/>
-        </w:rPr>
-        <w:t>Defendant's 2020 inspection documented hail dents warranting repair on only those two sashes and identified no other dented sash or window anywhere on the home.</w:t>
-      </w:r>
-      <w:r>
-        <w:t xml:space="preserve"> Defendant's own record therefore reflects that, as </w:t>
-      </w:r>
-      <w:r>
-        <w:lastRenderedPageBreak/>
-        <w:t xml:space="preserve">of October 13, 2020, no window or sash on the property other than the two paid sashes was identified as </w:t>
-      </w:r>
-      <w:proofErr w:type="gramStart"/>
-      <w:r>
-        <w:t>hail-damaged</w:t>
-      </w:r>
-      <w:proofErr w:type="gramEnd"/>
-      <w:r>
-        <w:t>. Any dent that the 2024 inspections documented on a different sash or window is, by Defendant's own baseline, damage that post-dates the 2020 inspection.</w:t>
-      </w:r>
-    </w:p>
-    <w:p>
-      <w:pPr>
-        <w:tabs>
-          <w:tab w:val="left" w:pos="1440"/>
-        </w:tabs>
-        <w:spacing w:after="120" w:line="480" w:lineRule="auto"/>
-        <w:ind w:left="1440" w:hanging="720"/>
-      </w:pPr>
-      <w:r>
-        <w:t>c.</w:t>
-      </w:r>
-      <w:r>
-        <w:tab/>
-      </w:r>
-      <w:r>
-        <w:rPr>
-          <w:b/>
-          <w:bCs/>
-        </w:rPr>
-        <w:t xml:space="preserve">The only documented hail event at the property after the 2020 inspection is the July 13, </w:t>
-      </w:r>
-      <w:proofErr w:type="gramStart"/>
-      <w:r>
-        <w:rPr>
-          <w:b/>
-          <w:bCs/>
-        </w:rPr>
-        <w:t>2024</w:t>
-      </w:r>
-      <w:proofErr w:type="gramEnd"/>
-      <w:r>
-        <w:rPr>
-          <w:b/>
-          <w:bCs/>
-        </w:rPr>
-        <w:t xml:space="preserve"> hailstorm.</w:t>
-      </w:r>
-      <w:r>
-        <w:t xml:space="preserve"> The post-2020 dents the Prieve report catalogs across at least nineteen windows therefore align with the July 13, </w:t>
-      </w:r>
-      <w:proofErr w:type="gramStart"/>
-      <w:r>
-        <w:t>2024</w:t>
-      </w:r>
-      <w:proofErr w:type="gramEnd"/>
-      <w:r>
-        <w:t xml:space="preserve"> loss and cannot be attributed to the 2020 claim, which by Defendant's own scope reached only two sashes.</w:t>
-      </w:r>
-    </w:p>
-    <w:p>
-      <w:pPr>
-        <w:tabs>
-          <w:tab w:val="left" w:pos="1440"/>
-        </w:tabs>
-        <w:spacing w:after="120" w:line="480" w:lineRule="auto"/>
-        <w:ind w:left="1440" w:hanging="720"/>
-      </w:pPr>
-      <w:r>
-        <w:t>d.</w:t>
-      </w:r>
-      <w:r>
-        <w:tab/>
-      </w:r>
-      <w:r>
-        <w:rPr>
-          <w:b/>
-          <w:bCs/>
-        </w:rPr>
-        <w:t>Prieve's attribution of dents to “a prior hail claim” exceeds what Defendant's 2020 file can support.</w:t>
-      </w:r>
-      <w:r>
-        <w:t xml:space="preserve"> The Prieve report documents dents at additional sashes on the same windows and attributes “rounded dents … at sashes” on multiple windows to “a prior hail claim,” yet Defendant's 2020 scope compensated only two sashes. The “prior claim” basket cannot hold more sashes than Defendant's own 2020 record documented, and Prieve's attribution of additional sashes to the 2020 claim is contradicted by Defendant's own file.</w:t>
-      </w:r>
-    </w:p>
-    <w:p>
-      <w:pPr>
-        <w:tabs>
-          <w:tab w:val="left" w:pos="1440"/>
-        </w:tabs>
-        <w:spacing w:after="120" w:line="480" w:lineRule="auto"/>
-        <w:ind w:left="1440" w:hanging="720"/>
-      </w:pPr>
-      <w:r>
-        <w:t>e.</w:t>
-      </w:r>
-      <w:r>
-        <w:tab/>
-      </w:r>
-      <w:r>
-        <w:rPr>
-          <w:b/>
-          <w:bCs/>
-        </w:rPr>
-        <w:t>Defendant's 2020 photo log records observations its 2020 estimate did not pay.</w:t>
-      </w:r>
-      <w:r>
-        <w:t xml:space="preserve"> At page 7 of the Prieve report the engineer acknowledges that the chip he observed at trim board photograph A-53 “is visible in prior photo logs from Farmers Insurance dated October 13, 2020,” yet that trim damage </w:t>
-      </w:r>
-      <w:r>
-        <w:lastRenderedPageBreak/>
-        <w:t>was not addressed in the 2020 Xactimate. This confirms that Defendant's 2020 photo log and 2020 payment scope are not coextensive, and that the precise per-sash 2020 scope is fixed by the 2020 Xactimate and photo log — records Defendant has not produced in full.</w:t>
-      </w:r>
-    </w:p>
-    <w:p>
-      <w:pPr>
-        <w:spacing w:before="160" w:after="80"/>
-      </w:pPr>
-      <w:r>
-        <w:rPr>
-          <w:b/>
-          <w:bCs/>
-        </w:rPr>
-        <w:t>F. The “Engineer's Report Only” Gatekeeping Rule</w:t>
-      </w:r>
-    </w:p>
-    <w:p>
-      <w:pPr>
-        <w:tabs>
-          <w:tab w:val="left" w:pos="720"/>
-        </w:tabs>
-        <w:spacing w:after="120" w:line="480" w:lineRule="auto"/>
-        <w:ind w:left="720" w:hanging="720"/>
-      </w:pPr>
-      <w:r>
-        <w:t>24.</w:t>
-      </w:r>
-      <w:r>
-        <w:tab/>
-        <w:t>On February 3, 2025, Defendant's field claim supervisor, Bradlee Monson, told Plaintiffs by telephone that Defendant would not review any evidence or documents from Plaintiffs unless they were provided by an engineer. Mr. Monson added during the same conversation that “extruded aluminum windows are easily damaged.”</w:t>
-      </w:r>
-    </w:p>
-    <w:p>
-      <w:pPr>
-        <w:tabs>
-          <w:tab w:val="left" w:pos="720"/>
-        </w:tabs>
-        <w:spacing w:after="120" w:line="480" w:lineRule="auto"/>
-        <w:ind w:left="720" w:hanging="720"/>
-      </w:pPr>
-      <w:r>
-        <w:t>25.</w:t>
-      </w:r>
-      <w:r>
-        <w:tab/>
-        <w:t xml:space="preserve">On February 10, 2025 at 11:06 AM, Defendant's adjuster Nicholas Brau left a voicemail confirming the rule and attributing it to Mr. Monson: “Brad reached out to me on the field claim supervisor wanted me to let you know that he did receive the information that you just sent in recently but it's not an </w:t>
-      </w:r>
-      <w:proofErr w:type="spellStart"/>
-      <w:r>
-        <w:t>engineers</w:t>
-      </w:r>
-      <w:proofErr w:type="spellEnd"/>
-      <w:r>
-        <w:t xml:space="preserve"> report so I believe that's what he wanted to look for from you.”</w:t>
-      </w:r>
-    </w:p>
-    <w:p>
-      <w:pPr>
-        <w:tabs>
-          <w:tab w:val="left" w:pos="720"/>
-        </w:tabs>
-        <w:spacing w:after="120" w:line="480" w:lineRule="auto"/>
-        <w:ind w:left="720" w:hanging="720"/>
-      </w:pPr>
-      <w:r>
-        <w:t>26.</w:t>
-      </w:r>
-      <w:r>
-        <w:tab/>
-      </w:r>
-      <w:r>
-        <w:rPr>
-          <w:b/>
-          <w:bCs/>
-        </w:rPr>
-        <w:t>The policy contains no provision requiring evidence to come from an engineer.</w:t>
-      </w:r>
-      <w:r>
-        <w:t xml:space="preserve"> The “engineer's report only” rule was articulated at the supervisor level and enforced through the assigned adjuster. The rule was used to refuse review of (a) Plaintiffs' January 31, 2025 appeal package containing </w:t>
-      </w:r>
-      <w:proofErr w:type="spellStart"/>
-      <w:r>
-        <w:t>stormersite</w:t>
-      </w:r>
-      <w:proofErr w:type="spellEnd"/>
-      <w:r>
-        <w:t xml:space="preserve"> weather data and post-2021 gutter-replacement evidence, (b) Plaintiffs' February 10, 2025 second response containing City of Eden Prairie permit records and the 14-of-19 </w:t>
-      </w:r>
-      <w:r>
-        <w:lastRenderedPageBreak/>
-        <w:t>neighbor canvass, and (c) Plaintiffs' May 28, 2025 submission of the National Weather Service article and Interactive Hail Maps data delivered through Defendant's own agent Peter Pietila.</w:t>
-      </w:r>
-    </w:p>
-    <w:p>
-      <w:pPr>
-        <w:spacing w:before="160" w:after="80"/>
-      </w:pPr>
-      <w:r>
-        <w:rPr>
-          <w:b/>
-          <w:bCs/>
-        </w:rPr>
-        <w:t>G. Plaintiffs' Repeated Submissions of Disproving Evidence; Defendant's Refusal to Engage</w:t>
-      </w:r>
-    </w:p>
-    <w:p>
-      <w:pPr>
-        <w:tabs>
-          <w:tab w:val="left" w:pos="720"/>
-        </w:tabs>
-        <w:spacing w:after="120" w:line="480" w:lineRule="auto"/>
-        <w:ind w:left="720" w:hanging="720"/>
-      </w:pPr>
-      <w:r>
-        <w:t>27.</w:t>
-      </w:r>
-      <w:r>
-        <w:tab/>
-        <w:t xml:space="preserve">Beginning on September 5, </w:t>
-      </w:r>
-      <w:proofErr w:type="gramStart"/>
-      <w:r>
-        <w:t>2024</w:t>
-      </w:r>
-      <w:proofErr w:type="gramEnd"/>
-      <w:r>
-        <w:t xml:space="preserve"> and continuing through May 28, 2025, Plaintiffs submitted four separate rounds of evidence disproving the factual premises of Defendant's denials. Defendant did not retract the denials, did not reopen the claim, and did not engage substantively with any of the submissions. Plaintiffs' regulatory complaint to the Minnesota Department of Commerce filed November 19, 2024 (Complaint ID 93547) was processed and escalated to Director-level review but produced no compulsory action.</w:t>
-      </w:r>
-    </w:p>
-    <w:p>
-      <w:pPr>
-        <w:spacing w:before="160" w:after="80"/>
-      </w:pPr>
-      <w:r>
-        <w:rPr>
-          <w:b/>
-          <w:bCs/>
-        </w:rPr>
-        <w:t>H. Plaintiffs' Direct Inquiry About Deadlines; Defendant's Non-Answer; Defendant's Continued Participation in the Claim</w:t>
-      </w:r>
-    </w:p>
-    <w:p>
-      <w:pPr>
-        <w:tabs>
-          <w:tab w:val="left" w:pos="720"/>
-        </w:tabs>
-        <w:spacing w:after="120" w:line="480" w:lineRule="auto"/>
-        <w:ind w:left="720" w:hanging="720"/>
-      </w:pPr>
-      <w:r>
-        <w:t>28.</w:t>
-      </w:r>
-      <w:r>
-        <w:tab/>
-        <w:t xml:space="preserve">On July 10, 2025, Plaintiffs wrote to Defendant's adjuster Nicholas Brau, field claim supervisor Bradlee Monson, and agent Peter Pietila, asking in writing: “Is there any other deadline for hail claim 7007986837-1? If there is any, this email would also serve as our request to extend those deadline(s).” On July 11, 2025, Mr. Brau responded through Defendant's Claim Portal with only the following generic paragraph: “Please note there are time limits set forth in the Conditions (‘Lawsuits Against Us’ or ‘Legal Action Against Us’ or ‘Suit Against Us’) section of the policy which, depending on your state, may affect the time within which you may pursue your claim. This period may have been extended by statute or </w:t>
-      </w:r>
-      <w:r>
-        <w:lastRenderedPageBreak/>
-        <w:t>case law.” The response identified no specific deadline and did not address Plaintiffs' request for an extension. Plaintiffs' same-day follow-up of July 11, 2025, confirming their understanding that the only applicable deadline was the policy's two-year suit limitation, drew no response or correction from Mr. Brau or anyone else at Farmers.</w:t>
-      </w:r>
-    </w:p>
-    <w:p>
-      <w:pPr>
-        <w:tabs>
-          <w:tab w:val="left" w:pos="720"/>
-        </w:tabs>
-        <w:spacing w:after="120" w:line="480" w:lineRule="auto"/>
-        <w:ind w:left="720" w:hanging="720"/>
-      </w:pPr>
-      <w:r>
-        <w:t>29.</w:t>
-      </w:r>
-      <w:r>
-        <w:tab/>
-        <w:t>After Plaintiffs' July 10, 2025 deadline inquiry, Defendant continued to treat the claim as live and participated fully in the contractual appraisal process: Defendant accepted Plaintiffs' August 3, 2025 Demand for Appraisal, named its own appraiser within the statutory window, and proceeded through the September 12, 2025 appraisal inspection and award without ever identifying any deadline shorter than the policy's two-year suit-limitation period or asserting that any limitation period had expired. To the extent any endorsement, statute, or other instrument is later asserted to impose a suit-limitation period shorter than two years, Defendant, by the conduct described in this paragraph and paragraph 28, waived any such shorter period and is estopped from asserting it.</w:t>
-      </w:r>
-    </w:p>
-    <w:p>
-      <w:pPr>
-        <w:spacing w:before="160" w:after="80"/>
-      </w:pPr>
-      <w:r>
-        <w:rPr>
-          <w:b/>
-          <w:bCs/>
-        </w:rPr>
-        <w:t>I. The Appraisal Process</w:t>
-      </w:r>
-    </w:p>
-    <w:p>
-      <w:pPr>
-        <w:tabs>
-          <w:tab w:val="left" w:pos="720"/>
-        </w:tabs>
-        <w:spacing w:after="120" w:line="480" w:lineRule="auto"/>
-        <w:ind w:left="720" w:hanging="720"/>
-      </w:pPr>
-      <w:r>
-        <w:t>30.</w:t>
-      </w:r>
-      <w:r>
-        <w:tab/>
-        <w:t>On August 3, 2025, Pure Construction, on behalf of Plaintiffs, filed a formal Demand for Appraisal under Minn. Stat. § 65A.01, naming claim 7007986837-1-1, loss date July 13, 2024, and three items in dispute: Windows, Siding (repaint), and Siding (replace and remove). Plaintiffs filed a Sworn Statement on Proof of Loss with the demand stating a total claimed loss of $310,000 against Coverage A of $886,000 with a $17,720 deductible.</w:t>
-      </w:r>
-    </w:p>
-    <w:p>
-      <w:pPr>
-        <w:tabs>
-          <w:tab w:val="left" w:pos="720"/>
-        </w:tabs>
-        <w:spacing w:after="120" w:line="480" w:lineRule="auto"/>
-        <w:ind w:left="720" w:hanging="720"/>
-      </w:pPr>
-      <w:r>
-        <w:lastRenderedPageBreak/>
-        <w:t>31.</w:t>
-      </w:r>
-      <w:r>
-        <w:tab/>
-        <w:t xml:space="preserve">The appraisal proceeded under § 65A.01. Plaintiffs' appraiser was John Foster, who was selected and retained through contractor Pure Construction; Plaintiffs did not select, interview, or vet Mr. Foster, and Plaintiffs were asked not to speak with any member of the appraisal panel before, during, or after the September 12, </w:t>
+        <w:t xml:space="preserve">not select, interview, or vet Mr. Foster, and Plaintiffs were asked not to speak with any member of the appraisal panel before, during, or after the September 12, </w:t>
       </w:r>
       <w:proofErr w:type="gramStart"/>
       <w:r>
@@ -1696,19 +1684,19 @@
           <w:b/>
           <w:bCs/>
         </w:rPr>
+        <w:t>J. Post-Appraisal Refusal to Engage</w:t>
+      </w:r>
+    </w:p>
+    <w:p>
+      <w:pPr>
+        <w:tabs>
+          <w:tab w:val="left" w:pos="720"/>
+        </w:tabs>
+        <w:spacing w:after="120" w:line="480" w:lineRule="auto"/>
+        <w:ind w:left="720" w:hanging="720"/>
+      </w:pPr>
+      <w:r>
         <w:lastRenderedPageBreak/>
-        <w:t>J. Post-Appraisal Refusal to Engage</w:t>
-      </w:r>
-    </w:p>
-    <w:p>
-      <w:pPr>
-        <w:tabs>
-          <w:tab w:val="left" w:pos="720"/>
-        </w:tabs>
-        <w:spacing w:after="120" w:line="480" w:lineRule="auto"/>
-        <w:ind w:left="720" w:hanging="720"/>
-      </w:pPr>
-      <w:r>
         <w:t>36.</w:t>
       </w:r>
       <w:r>

</xml_diff>

<commit_message>
Updated for sash vs window
</commit_message>
<xml_diff>
--- a/Filings/Complaint_Lu_Hu_v_Fire_Insurance_Exchange_FINAL.docx
+++ b/Filings/Complaint_Lu_Hu_v_Fire_Insurance_Exchange_FINAL.docx
@@ -886,11 +886,13 @@
       </w:r>
       <w:r>
         <w:tab/>
-        <w:t xml:space="preserve">National Weather Service Twin Cities/Chanhassen documentation of severe thunderstorms across Minnesota on July 13–14, 2024 with hail up to 3.5–4 </w:t>
+      </w:r>
+      <w:r>
+        <w:t xml:space="preserve">National Weather Service Twin Cities/Chanhassen documentation of the July 13–14, 2024 storm system, which produced hail up to 3.5–4 inches </w:t>
       </w:r>
       <w:r>
         <w:lastRenderedPageBreak/>
-        <w:t xml:space="preserve">inches and a 48 MPH wind gust at Eden Prairie ASOS at 1:00 AM on July 14, </w:t>
+        <w:t xml:space="preserve">across the region and a 48 MPH wind gust recorded at the Eden Prairie ASOS station at 1:00 AM on July 14, </w:t>
       </w:r>
       <w:proofErr w:type="gramStart"/>
       <w:r>
@@ -1075,11 +1077,26 @@
         <w:t xml:space="preserve"> independently deficient on its face.</w:t>
       </w:r>
       <w:r>
-        <w:t xml:space="preserve"> The deficiencies include: (a) Defendant scoped Prieve's engagement to “windows only,” excluding from the engineer's mandate the siding, downspouts, flashing, and doors Plaintiffs had reported as damaged, yet Defendant used the report — whose Conclusions purport to opine on siding as well — as the basis for denying the entire claim; (b) Prieve's own Photo Appendix A documents non-window damage in its captions (dented downspouts at A-42, A-91 through A-93, A-98 and A-99; dented flashing at A-103; chipped trim </w:t>
+        <w:t xml:space="preserve"> The deficiencies include</w:t>
+      </w:r>
+      <w:r>
+        <w:t>, without limitation</w:t>
+      </w:r>
+      <w:r>
+        <w:t xml:space="preserve">:  </w:t>
+      </w:r>
+      <w:r>
+        <w:t xml:space="preserve">a. </w:t>
+      </w:r>
+      <w:r>
+        <w:tab/>
+      </w:r>
+      <w:r>
+        <w:t>Defendant scoped Prieve's engagement to “windows only,” excluding from the engineer's mandate the siding, downspouts, flashing, and doors Plaintiffs had reported as damaged, yet Defendant used the report — whose Conclusions purport to opine on siding as well — as the basis for denying the entire claim; (b) Prieve's own Photo Appendix A documents non-window damage in its captions (dented downspouts at A-42, A-91 through A-93, A-98 and A-99; dented flashing at A-</w:t>
       </w:r>
       <w:r>
         <w:lastRenderedPageBreak/>
-        <w:t xml:space="preserve">board at </w:t>
+        <w:t xml:space="preserve">103; chipped trim board at </w:t>
       </w:r>
       <w:r>
         <w:t>A-53, A-54</w:t>
@@ -1088,11 +1105,11 @@
         <w:t xml:space="preserve">, </w:t>
       </w:r>
       <w:r>
-        <w:t xml:space="preserve">A-90 and A-148) that the report's narrative and Conclusions do not address; (c) Plaintiffs' gutters and downspouts were replaced after September 13, 2021, such that any dent on those components physically cannot pre-date late 2021 and is direct physical evidence of post-2020 hail activity at the property; (d) the report's Background section acknowledges that “Convective storm activity and hail have been reported on multiple occasions in the area of the subject structure” while its Conclusion 1 states that “no recent hail damage has occurred” — internally inconsistent statements the report does not reconcile; (e) the report's narrative uses the word “dent” or “dents” sixteen separate times on a single page (the east-side discussion) before concluding “no recent hail damage has occurred”; (f) the report contains no quantitative impact-force calculation, no terminal-velocity calculation, no material-specific dent-depth threshold for extruded aluminum or aluminum-clad wood windows, no peer-reviewed citation, and no stated error rate; (g) Conclusion 4's directional dismissal of damage on the east elevation (“storms moving from west to east with hail originating from a westerly direction”) is a generalization not derived from the specific July 13–14, 2024 storm event, which the National Weather Service documents as a multi-round overnight system with severe weather across Minnesota; the generalization is further refuted by Defendant's own September 12, 2025 appraisal award, which awarded a rear/east window (B1.2, family room) as a hail loss alongside a front/west window (F1.7), thereby confirming that hail damaged the east elevation of the dwelling, and by the fact that wind direction is not fixed within a single </w:t>
+        <w:t xml:space="preserve">A-90 and A-148) that the report's narrative and Conclusions do not address; (c) Plaintiffs' gutters and downspouts were replaced after September 13, 2021, such that any dent on those components physically cannot pre-date late 2021 and is direct physical evidence of post-2020 hail activity at the property; (d) the report's Background section acknowledges that “Convective storm activity and hail have been reported on multiple occasions in the area of the subject structure” while its Conclusion 1 states that “no recent hail damage has occurred” — internally inconsistent statements the report does not reconcile; (e) the report's narrative uses the word “dent” or “dents” sixteen separate times on a single page (the east-side discussion) before concluding “no recent hail damage has occurred”; (f) the report contains no quantitative impact-force calculation, no terminal-velocity calculation, no material-specific dent-depth threshold for extruded aluminum or aluminum-clad wood windows, no peer-reviewed citation, and no stated error rate; (g) Conclusion 4's directional dismissal of damage on the east elevation (“storms moving from west to east with hail originating from a westerly direction”) is a generalization not derived from the specific July 13–14, 2024 storm event, which the National Weather Service documents as a multi-round overnight system with severe weather across Minnesota; the generalization is further refuted by Defendant's own September 12, 2025 appraisal award, which awarded a rear/east window (B1.2, family room) as a hail loss alongside a front/west window (F1.7), thereby confirming that hail damaged the east elevation of the dwelling, and by the fact that wind direction is </w:t>
       </w:r>
       <w:r>
         <w:lastRenderedPageBreak/>
-        <w:t xml:space="preserve">storm — surface winds veer and back as a storm cell approaches, passes, and departs, and gust fronts, outflow boundaries, and a rotating updraft can drive hail against multiple faces of a structure during the same event; (h) the report's Activities section does not list as inputs the Hancock August 29, 2024 inspection </w:t>
+        <w:t xml:space="preserve">not fixed within a single storm — surface winds veer and back as a storm cell approaches, passes, and departs, and gust fronts, outflow boundaries, and a rotating updraft can drive hail against multiple faces of a structure during the same event; (h) the report's Activities section does not list as inputs the Hancock August 29, 2024 inspection </w:t>
       </w:r>
       <w:proofErr w:type="spellStart"/>
       <w:r>

</xml_diff>